<commit_message>
docs: stand address in the reviewer handout
Co-Authored-By: Claude Opus 5.5 (1M context) <noreply@anthropic.com>
</commit_message>
<xml_diff>
--- a/docs/delivery/out/Памятка для проверяющего.docx
+++ b/docs/delivery/out/Памятка для проверяющего.docx
@@ -116,7 +116,7 @@
       <w:r>
         <w:fldChar w:fldCharType="separate"/>
       </w:r>
-      <w:hyperlink w:anchor="_Toc241594777" w:history="1">
+      <w:hyperlink w:anchor="_Toc241596762" w:history="1">
         <w:r>
           <w:rPr>
             <w:rStyle w:val="aff8"/>
@@ -143,7 +143,7 @@
             <w:noProof/>
             <w:webHidden/>
           </w:rPr>
-          <w:instrText xml:space="preserve"> PAGEREF _Toc241594777 \h </w:instrText>
+          <w:instrText xml:space="preserve"> PAGEREF _Toc241596762 \h </w:instrText>
         </w:r>
         <w:r>
           <w:rPr>
@@ -186,7 +186,7 @@
           <w:lang w:val="ru-RU" w:eastAsia="ru-RU"/>
         </w:rPr>
       </w:pPr>
-      <w:hyperlink w:anchor="_Toc241594778" w:history="1">
+      <w:hyperlink w:anchor="_Toc241596763" w:history="1">
         <w:r>
           <w:rPr>
             <w:rStyle w:val="aff8"/>
@@ -213,7 +213,7 @@
             <w:noProof/>
             <w:webHidden/>
           </w:rPr>
-          <w:instrText xml:space="preserve"> PAGEREF _Toc241594778 \h </w:instrText>
+          <w:instrText xml:space="preserve"> PAGEREF _Toc241596763 \h </w:instrText>
         </w:r>
         <w:r>
           <w:rPr>
@@ -256,7 +256,7 @@
           <w:lang w:val="ru-RU" w:eastAsia="ru-RU"/>
         </w:rPr>
       </w:pPr>
-      <w:hyperlink w:anchor="_Toc241594779" w:history="1">
+      <w:hyperlink w:anchor="_Toc241596764" w:history="1">
         <w:r>
           <w:rPr>
             <w:rStyle w:val="aff8"/>
@@ -283,7 +283,7 @@
             <w:noProof/>
             <w:webHidden/>
           </w:rPr>
-          <w:instrText xml:space="preserve"> PAGEREF _Toc241594779 \h </w:instrText>
+          <w:instrText xml:space="preserve"> PAGEREF _Toc241596764 \h </w:instrText>
         </w:r>
         <w:r>
           <w:rPr>
@@ -326,7 +326,7 @@
           <w:lang w:val="ru-RU" w:eastAsia="ru-RU"/>
         </w:rPr>
       </w:pPr>
-      <w:hyperlink w:anchor="_Toc241594780" w:history="1">
+      <w:hyperlink w:anchor="_Toc241596765" w:history="1">
         <w:r>
           <w:rPr>
             <w:rStyle w:val="aff8"/>
@@ -353,7 +353,7 @@
             <w:noProof/>
             <w:webHidden/>
           </w:rPr>
-          <w:instrText xml:space="preserve"> PAGEREF _Toc241594780 \h </w:instrText>
+          <w:instrText xml:space="preserve"> PAGEREF _Toc241596765 \h </w:instrText>
         </w:r>
         <w:r>
           <w:rPr>
@@ -398,7 +398,7 @@
       <w:pPr>
         <w:pStyle w:val="1"/>
       </w:pPr>
-      <w:bookmarkStart w:id="0" w:name="_Toc241594777"/>
+      <w:bookmarkStart w:id="0" w:name="_Toc241596762"/>
       <w:r>
         <w:lastRenderedPageBreak/>
         <w:t>Памятка для проверяющего</w:t>
@@ -417,7 +417,7 @@
       <w:pPr>
         <w:pStyle w:val="21"/>
       </w:pPr>
-      <w:bookmarkStart w:id="1" w:name="_Toc241594778"/>
+      <w:bookmarkStart w:id="1" w:name="_Toc241596763"/>
       <w:r>
         <w:t>1. Адреса</w:t>
       </w:r>
@@ -431,10 +431,10 @@
         <w:rPr>
           <w:b/>
         </w:rPr>
-        <w:t>https://СТЕНД</w:t>
+        <w:t>https://collector-forecast.duckdns.org</w:t>
       </w:r>
       <w:r>
-        <w:t xml:space="preserve"> (подставьте адрес, выданный командой). Все разделы — на одном адресе.</w:t>
+        <w:t>. Все разделы — на одном адресе.</w:t>
       </w:r>
     </w:p>
     <w:tbl>
@@ -516,7 +516,7 @@
               <w:rPr>
                 <w:sz w:val="18"/>
               </w:rPr>
-              <w:t>https://СТЕНД/</w:t>
+              <w:t>https://collector-forecast.duckdns.org/</w:t>
             </w:r>
           </w:p>
         </w:tc>
@@ -534,7 +534,13 @@
               <w:rPr>
                 <w:sz w:val="18"/>
               </w:rPr>
-              <w:t>Учебный контур (полигон Мю, Кси, Тау)</w:t>
+              <w:t>Учебный контур (полигон Мю, Кси, Т</w:t>
+            </w:r>
+            <w:r>
+              <w:rPr>
+                <w:sz w:val="18"/>
+              </w:rPr>
+              <w:t>ау)</w:t>
             </w:r>
           </w:p>
         </w:tc>
@@ -547,13 +553,7 @@
               <w:rPr>
                 <w:sz w:val="18"/>
               </w:rPr>
-              <w:t>https://</w:t>
-            </w:r>
-            <w:r>
-              <w:rPr>
-                <w:sz w:val="18"/>
-              </w:rPr>
-              <w:t>СТЕНД/training/</w:t>
+              <w:t>https://collector-forecast.duckdns.org/training/</w:t>
             </w:r>
           </w:p>
         </w:tc>
@@ -584,7 +584,7 @@
               <w:rPr>
                 <w:sz w:val="18"/>
               </w:rPr>
-              <w:t>https://СТЕНД/simulator/ — открывать из меню учебного контура «Симулятор датчиков»</w:t>
+              <w:t>https://collector-forecast.duckdns.org/simulator/ — открывать из меню учебного контура «Симулятор датчиков»</w:t>
             </w:r>
           </w:p>
         </w:tc>
@@ -615,13 +615,7 @@
               <w:rPr>
                 <w:sz w:val="18"/>
               </w:rPr>
-              <w:t xml:space="preserve">https://СТЕНД/helpdesk/ (учебного контура — </w:t>
-            </w:r>
-            <w:r>
-              <w:rPr>
-                <w:sz w:val="18"/>
-              </w:rPr>
-              <w:t>https://СТЕНД/training/helpdesk/)</w:t>
+              <w:t>https://collector-forecast.duckdns.org/helpdesk/ (учебного контура — https://collector-forecast.duckdns.org/training/helpdesk/)</w:t>
             </w:r>
           </w:p>
         </w:tc>
@@ -652,7 +646,7 @@
               <w:rPr>
                 <w:sz w:val="18"/>
               </w:rPr>
-              <w:t>https://СТЕНД/api/docs/</w:t>
+              <w:t>https://collector-forecast.duckdns.org/api/docs/</w:t>
             </w:r>
           </w:p>
         </w:tc>
@@ -683,7 +677,13 @@
               <w:rPr>
                 <w:sz w:val="18"/>
               </w:rPr>
-              <w:t>https://СТЕНД/admin/ — тем же входом, второй пароль не нужен</w:t>
+              <w:t>https://collector-forecast.duckdns.org/adm</w:t>
+            </w:r>
+            <w:r>
+              <w:rPr>
+                <w:sz w:val="18"/>
+              </w:rPr>
+              <w:t>in/ — тем же входом, второй пароль не нужен</w:t>
             </w:r>
           </w:p>
         </w:tc>
@@ -745,13 +745,7 @@
               <w:rPr>
                 <w:sz w:val="18"/>
               </w:rPr>
-              <w:t>м</w:t>
-            </w:r>
-            <w:r>
-              <w:rPr>
-                <w:sz w:val="18"/>
-              </w:rPr>
-              <w:t>еню «Prometheus» (администратор)</w:t>
+              <w:t>меню «Prometheus» (администратор)</w:t>
             </w:r>
           </w:p>
         </w:tc>
@@ -760,14 +754,17 @@
     <w:p/>
     <w:p>
       <w:r>
-        <w:t>Браузер — Chrome или Яндекс Браузер. На телефоне — тот же адрес, «Добавить на главный экран».</w:t>
+        <w:t>Браузер — Chrome или Яндекс Браузер. На телефоне — тот же адрес, «Добавить на</w:t>
+      </w:r>
+      <w:r>
+        <w:t xml:space="preserve"> главный экран».</w:t>
       </w:r>
     </w:p>
     <w:p>
       <w:pPr>
         <w:pStyle w:val="21"/>
       </w:pPr>
-      <w:bookmarkStart w:id="2" w:name="_Toc241594779"/>
+      <w:bookmarkStart w:id="2" w:name="_Toc241596764"/>
       <w:r>
         <w:t>2. Учётные записи</w:t>
       </w:r>
@@ -804,10 +801,7 @@
         <w:t>admin12345</w:t>
       </w:r>
       <w:r>
-        <w:t xml:space="preserve">. </w:t>
-      </w:r>
-      <w:r>
-        <w:t>Если пароль не подходит, его сменили на стенде — уточните у команды.</w:t>
+        <w:t>. Если пароль не подходит, его сменили на стенде — уточните у команды.</w:t>
       </w:r>
     </w:p>
     <w:tbl>
@@ -895,7 +889,13 @@
               <w:rPr>
                 <w:sz w:val="18"/>
               </w:rPr>
-              <w:t>Руководитель подразделения</w:t>
+              <w:t xml:space="preserve">Руководитель </w:t>
+            </w:r>
+            <w:r>
+              <w:rPr>
+                <w:sz w:val="18"/>
+              </w:rPr>
+              <w:t>подразделения</w:t>
             </w:r>
           </w:p>
         </w:tc>
@@ -1285,7 +1285,7 @@
       <w:pPr>
         <w:pStyle w:val="21"/>
       </w:pPr>
-      <w:bookmarkStart w:id="3" w:name="_Toc241594780"/>
+      <w:bookmarkStart w:id="3" w:name="_Toc241596765"/>
       <w:r>
         <w:lastRenderedPageBreak/>
         <w:t>3. Маршрут проверки</w:t>
@@ -1297,7 +1297,10 @@
         <w:pStyle w:val="31"/>
       </w:pPr>
       <w:r>
-        <w:t>3.1 Авария от сигнала до решения (10 минут, учебный контур)</w:t>
+        <w:t xml:space="preserve">3.1 Авария от сигнала до решения (10 </w:t>
+      </w:r>
+      <w:r>
+        <w:t>минут, учебный контур)</w:t>
       </w:r>
     </w:p>
     <w:p>
@@ -1334,13 +1337,7 @@
         <w:rPr>
           <w:b/>
         </w:rPr>
-        <w:t>«Симулятор датчик</w:t>
-      </w:r>
-      <w:r>
-        <w:rPr>
-          <w:b/>
-        </w:rPr>
-        <w:t>ов»</w:t>
+        <w:t>«Симулятор датчиков»</w:t>
       </w:r>
       <w:r>
         <w:t>.</w:t>
@@ -1369,7 +1366,10 @@
         <w:t>«Запустить»</w:t>
       </w:r>
       <w:r>
-        <w:t>. Под описанием — что должен сделать диспетчер.</w:t>
+        <w:t>. Под описанием — что должен сделать дис</w:t>
+      </w:r>
+      <w:r>
+        <w:t>петчер.</w:t>
       </w:r>
     </w:p>
     <w:p>
@@ -1396,10 +1396,7 @@
         <w:t>«Рабочее место»</w:t>
       </w:r>
       <w:r>
-        <w:t xml:space="preserve">: </w:t>
-      </w:r>
-      <w:r>
-        <w:t>через несколько секунд появится карточка «Несанкционированный доступ», затем «Пожар».</w:t>
+        <w:t>: через несколько секунд появится карточка «Несанкционированный доступ», затем «Пожар».</w:t>
       </w:r>
     </w:p>
     <w:p>
@@ -1434,10 +1431,7 @@
         <w:t>«Решение»</w:t>
       </w:r>
       <w:r>
-        <w:t xml:space="preserve"> («Направлена проверка», что произошло — «Реал</w:t>
-      </w:r>
-      <w:r>
-        <w:t>ьное событие»).</w:t>
+        <w:t xml:space="preserve"> («Направлена проверка», что произошло — «Реальное событие»).</w:t>
       </w:r>
     </w:p>
     <w:p>
@@ -1460,7 +1454,13 @@
         <w:rPr>
           <w:b/>
         </w:rPr>
-        <w:t>«Черновик заявки»</w:t>
+        <w:t>«Черновик зая</w:t>
+      </w:r>
+      <w:r>
+        <w:rPr>
+          <w:b/>
+        </w:rPr>
+        <w:t>вки»</w:t>
       </w:r>
       <w:r>
         <w:t>.</w:t>
@@ -1514,13 +1514,7 @@
         <w:rPr>
           <w:b/>
         </w:rPr>
-        <w:t>«Передать в с</w:t>
-      </w:r>
-      <w:r>
-        <w:rPr>
-          <w:b/>
-        </w:rPr>
-        <w:t>истему заявок»</w:t>
+        <w:t>«Передать в систему заявок»</w:t>
       </w:r>
       <w:r>
         <w:t>.</w:t>
@@ -1531,7 +1525,7 @@
         <w:pStyle w:val="a"/>
       </w:pPr>
       <w:r>
-        <w:t>https://СТЕНД/training/helpdesk/ — та же заявка «с их стороны»; её стадии идут сами по времени или по кнопке.</w:t>
+        <w:t>https://collector-forecast.duckdns.org/training/helpdesk/ — та же заявка «с их стороны»; её стадии идут сами по времени или по кнопке.</w:t>
       </w:r>
     </w:p>
     <w:p>
@@ -1573,10 +1567,10 @@
         <w:t>«Выполнена»</w:t>
       </w:r>
       <w:r>
-        <w:t xml:space="preserve">: что </w:t>
+        <w:t>: ч</w:t>
       </w:r>
       <w:r>
-        <w:t>сделано, состояние оборудования.</w:t>
+        <w:t>то сделано, состояние оборудования.</w:t>
       </w:r>
     </w:p>
     <w:p>
@@ -1636,10 +1630,10 @@
         <w:t>«Журнал прогнозов»</w:t>
       </w:r>
       <w:r>
-        <w:t>: вероятность за 24</w:t>
+        <w:t>: вероятность за</w:t>
       </w:r>
       <w:r>
-        <w:t xml:space="preserve"> часа, уровень, причины.</w:t>
+        <w:t xml:space="preserve"> 24 часа, уровень, причины.</w:t>
       </w:r>
     </w:p>
     <w:p>
@@ -1689,10 +1683,10 @@
         <w:pStyle w:val="31"/>
       </w:pPr>
       <w:r>
-        <w:t>3.4 Карта и об</w:t>
+        <w:t>3.4 Карта и</w:t>
       </w:r>
       <w:r>
-        <w:t>ъекты (5 минут)</w:t>
+        <w:t xml:space="preserve"> объекты (5 минут)</w:t>
       </w:r>
     </w:p>
     <w:p>
@@ -1749,13 +1743,13 @@
         <w:rPr>
           <w:b/>
         </w:rPr>
-        <w:t>«Этаж</w:t>
+        <w:t>«Э</w:t>
       </w:r>
       <w:r>
         <w:rPr>
           <w:b/>
         </w:rPr>
-        <w:t>и»</w:t>
+        <w:t>тажи»</w:t>
       </w:r>
       <w:r>
         <w:t>: загрузить план, привязать по контрольным точкам, прозрачность.</w:t>
@@ -1828,10 +1822,10 @@
         <w:t>admin.volkov</w:t>
       </w:r>
       <w:r>
-        <w:t xml:space="preserve"> види</w:t>
+        <w:t xml:space="preserve"> в</w:t>
       </w:r>
       <w:r>
-        <w:t>т все разделы) → «План ТО», «Графики ТО и ППР».</w:t>
+        <w:t>идит все разделы) → «План ТО», «Графики ТО и ППР».</w:t>
       </w:r>
     </w:p>
     <w:p>
@@ -13566,7 +13560,7 @@
     <w:autoRedefine/>
     <w:uiPriority w:val="39"/>
     <w:unhideWhenUsed/>
-    <w:rsid w:val="00ED5A5C"/>
+    <w:rsid w:val="0067552F"/>
     <w:pPr>
       <w:spacing w:after="100"/>
     </w:pPr>
@@ -13578,7 +13572,7 @@
     <w:autoRedefine/>
     <w:uiPriority w:val="39"/>
     <w:unhideWhenUsed/>
-    <w:rsid w:val="00ED5A5C"/>
+    <w:rsid w:val="0067552F"/>
     <w:pPr>
       <w:spacing w:after="100"/>
       <w:ind w:left="220"/>
@@ -13589,7 +13583,7 @@
     <w:basedOn w:val="a2"/>
     <w:uiPriority w:val="99"/>
     <w:unhideWhenUsed/>
-    <w:rsid w:val="00ED5A5C"/>
+    <w:rsid w:val="0067552F"/>
     <w:rPr>
       <w:color w:val="0000FF" w:themeColor="hyperlink"/>
       <w:u w:val="single"/>

</xml_diff>